<commit_message>
docs: actualiza plantilla de confidencialidad y compromiso
</commit_message>
<xml_diff>
--- a/resources/templates/GCDTP-F-017_V01_Confidencialidad_y_compromiso.docx
+++ b/resources/templates/GCDTP-F-017_V01_Confidencialidad_y_compromiso.docx
@@ -592,7 +592,7 @@
     </w:p>
     <w:p>
       <w:pPr>
-        <w:pStyle w:val="Prrafodelista"/>
+        <w:pStyle w:val="ListParagraph"/>
         <w:numPr>
           <w:ilvl w:val="0"/>
           <w:numId w:val="2"/>
@@ -620,7 +620,7 @@
     </w:p>
     <w:p>
       <w:pPr>
-        <w:pStyle w:val="Prrafodelista"/>
+        <w:pStyle w:val="ListParagraph"/>
         <w:numPr>
           <w:ilvl w:val="0"/>
           <w:numId w:val="2"/>
@@ -688,7 +688,7 @@
     </w:p>
     <w:p>
       <w:pPr>
-        <w:pStyle w:val="Prrafodelista"/>
+        <w:pStyle w:val="ListParagraph"/>
         <w:numPr>
           <w:ilvl w:val="0"/>
           <w:numId w:val="2"/>
@@ -716,7 +716,7 @@
     </w:p>
     <w:p>
       <w:pPr>
-        <w:pStyle w:val="Prrafodelista"/>
+        <w:pStyle w:val="ListParagraph"/>
         <w:numPr>
           <w:ilvl w:val="0"/>
           <w:numId w:val="2"/>
@@ -766,7 +766,7 @@
     </w:p>
     <w:p>
       <w:pPr>
-        <w:pStyle w:val="Prrafodelista"/>
+        <w:pStyle w:val="ListParagraph"/>
         <w:spacing w:after="0" w:line="360" w:lineRule="auto"/>
         <w:jc w:val="both"/>
         <w:rPr>
@@ -801,7 +801,7 @@
     </w:p>
     <w:p>
       <w:pPr>
-        <w:pStyle w:val="Prrafodelista"/>
+        <w:pStyle w:val="ListParagraph"/>
         <w:numPr>
           <w:ilvl w:val="0"/>
           <w:numId w:val="2"/>
@@ -913,7 +913,7 @@
     </w:p>
     <w:p>
       <w:pPr>
-        <w:pStyle w:val="Textocomentario"/>
+        <w:pStyle w:val="CommentText"/>
         <w:spacing w:after="0" w:line="360" w:lineRule="auto"/>
         <w:jc w:val="both"/>
         <w:rPr>
@@ -962,7 +962,7 @@
     </w:p>
     <w:p>
       <w:pPr>
-        <w:pStyle w:val="Textocomentario"/>
+        <w:pStyle w:val="CommentText"/>
         <w:spacing w:after="0" w:line="360" w:lineRule="auto"/>
         <w:jc w:val="both"/>
         <w:rPr>
@@ -974,7 +974,7 @@
     </w:p>
     <w:p>
       <w:pPr>
-        <w:pStyle w:val="Textocomentario"/>
+        <w:pStyle w:val="CommentText"/>
         <w:spacing w:after="0" w:line="360" w:lineRule="auto"/>
         <w:jc w:val="both"/>
         <w:rPr>
@@ -1088,7 +1088,7 @@
     </w:p>
     <w:p>
       <w:pPr>
-        <w:pStyle w:val="Textocomentario"/>
+        <w:pStyle w:val="CommentText"/>
         <w:spacing w:after="0" w:line="360" w:lineRule="auto"/>
         <w:jc w:val="both"/>
         <w:rPr>
@@ -1101,7 +1101,7 @@
     </w:p>
     <w:p>
       <w:pPr>
-        <w:pStyle w:val="Textocomentario"/>
+        <w:pStyle w:val="CommentText"/>
         <w:spacing w:after="0" w:line="360" w:lineRule="auto"/>
         <w:jc w:val="both"/>
         <w:rPr>
@@ -1153,7 +1153,7 @@
     </w:p>
     <w:p>
       <w:pPr>
-        <w:pStyle w:val="Textocomentario"/>
+        <w:pStyle w:val="CommentText"/>
         <w:spacing w:after="0" w:line="360" w:lineRule="auto"/>
         <w:jc w:val="both"/>
         <w:rPr>
@@ -1226,7 +1226,23 @@
           <w:sz w:val="24"/>
           <w:szCs w:val="24"/>
         </w:rPr>
-        <w:t xml:space="preserve"> Lo datos intercambiados entre las partes no constituyen información confidencial en los siguientes casos: a) Cuando la parte receptora tenga evidencia de que conoce previamente la información recibida; b) Cuando la información </w:t>
+        <w:t xml:space="preserve"> Lo</w:t>
+      </w:r>
+      <w:r>
+        <w:rPr>
+          <w:rFonts w:eastAsiaTheme="majorEastAsia"/>
+          <w:sz w:val="24"/>
+          <w:szCs w:val="24"/>
+        </w:rPr>
+        <w:t>s</w:t>
+      </w:r>
+      <w:r>
+        <w:rPr>
+          <w:rFonts w:eastAsiaTheme="majorEastAsia"/>
+          <w:sz w:val="24"/>
+          <w:szCs w:val="24"/>
+        </w:rPr>
+        <w:t xml:space="preserve"> datos intercambiados entre las partes no constituyen información confidencial en los siguientes casos: a) Cuando la parte receptora tenga evidencia de que conoce previamente la información recibida; b) Cuando la información </w:t>
       </w:r>
       <w:r>
         <w:rPr>
@@ -6221,8 +6237,9 @@
           <w:sz w:val="16"/>
           <w:szCs w:val="16"/>
         </w:rPr>
-        <w:t>” Apreciado (usuario, empresario, aprendiz, ciudadano, etc.), de conformidad con la establecido en la política de protección de datos del Servicio Nacional de Aprendizaje SENA, la finalidad y tratamiento de los datos personales requeridos a través de esta canal de atención es la gestión, prestación y personalización de nuestros servicios. Al continuar da su consentimiento para que el SENA trate sus datos personales. Para más información consulte la política en la página WEB de la entidad.</w:t>
-      </w:r>
+        <w:t xml:space="preserve">” Apreciado (usuario, empresario, aprendiz, ciudadano, etc.), de conformidad con </w:t>
+      </w:r>
+      <w:proofErr w:type="spellStart"/>
       <w:r>
         <w:rPr>
           <w:rFonts w:cstheme="minorHAnsi"/>
@@ -6233,7 +6250,7 @@
           <w:sz w:val="16"/>
           <w:szCs w:val="16"/>
         </w:rPr>
-        <w:t xml:space="preserve"> </w:t>
+        <w:t>lo</w:t>
       </w:r>
       <w:r>
         <w:rPr>
@@ -6245,6 +6262,103 @@
           <w:sz w:val="16"/>
           <w:szCs w:val="16"/>
         </w:rPr>
+        <w:t>establecido</w:t>
+      </w:r>
+      <w:proofErr w:type="spellEnd"/>
+      <w:r>
+        <w:rPr>
+          <w:rFonts w:cstheme="minorHAnsi"/>
+          <w:bCs/>
+          <w:i/>
+          <w:iCs/>
+          <w:spacing w:val="2"/>
+          <w:sz w:val="16"/>
+          <w:szCs w:val="16"/>
+        </w:rPr>
+        <w:t xml:space="preserve"> en la política de protección de datos del Servicio Nacional de Aprendizaje SENA, la finalidad y tratamiento de los datos personales requeridos a través de es</w:t>
+      </w:r>
+      <w:r>
+        <w:rPr>
+          <w:rFonts w:cstheme="minorHAnsi"/>
+          <w:bCs/>
+          <w:i/>
+          <w:iCs/>
+          <w:spacing w:val="2"/>
+          <w:sz w:val="16"/>
+          <w:szCs w:val="16"/>
+        </w:rPr>
+        <w:t>te</w:t>
+      </w:r>
+      <w:r>
+        <w:rPr>
+          <w:rFonts w:cstheme="minorHAnsi"/>
+          <w:bCs/>
+          <w:i/>
+          <w:iCs/>
+          <w:spacing w:val="2"/>
+          <w:sz w:val="16"/>
+          <w:szCs w:val="16"/>
+        </w:rPr>
+        <w:t xml:space="preserve"> canal de atención es la gestión, prestación y personalización de nuestros servicios. Al continuar</w:t>
+      </w:r>
+      <w:r>
+        <w:rPr>
+          <w:rFonts w:cstheme="minorHAnsi"/>
+          <w:bCs/>
+          <w:i/>
+          <w:iCs/>
+          <w:spacing w:val="2"/>
+          <w:sz w:val="16"/>
+          <w:szCs w:val="16"/>
+        </w:rPr>
+        <w:t xml:space="preserve"> </w:t>
+      </w:r>
+      <w:r>
+        <w:rPr>
+          <w:rFonts w:cstheme="minorHAnsi"/>
+          <w:bCs/>
+          <w:i/>
+          <w:iCs/>
+          <w:spacing w:val="2"/>
+          <w:sz w:val="16"/>
+          <w:szCs w:val="16"/>
+        </w:rPr>
+        <w:t>usted otorga</w:t>
+      </w:r>
+      <w:r>
+        <w:rPr>
+          <w:rFonts w:cstheme="minorHAnsi"/>
+          <w:bCs/>
+          <w:i/>
+          <w:iCs/>
+          <w:spacing w:val="2"/>
+          <w:sz w:val="16"/>
+          <w:szCs w:val="16"/>
+        </w:rPr>
+        <w:t xml:space="preserve"> su consentimiento para que el SENA trate sus datos personales. Para más información consulte la política en la página WEB de la entidad.</w:t>
+      </w:r>
+      <w:r>
+        <w:rPr>
+          <w:rFonts w:cstheme="minorHAnsi"/>
+          <w:bCs/>
+          <w:i/>
+          <w:iCs/>
+          <w:spacing w:val="2"/>
+          <w:sz w:val="16"/>
+          <w:szCs w:val="16"/>
+        </w:rPr>
+        <w:t xml:space="preserve"> </w:t>
+      </w:r>
+      <w:r>
+        <w:rPr>
+          <w:rFonts w:cstheme="minorHAnsi"/>
+          <w:bCs/>
+          <w:i/>
+          <w:iCs/>
+          <w:spacing w:val="2"/>
+          <w:sz w:val="16"/>
+          <w:szCs w:val="16"/>
+        </w:rPr>
         <w:t>En cualquier momento podrá solicitar al SENA conocer, actualizar, rectificar y/o suprimir sus datos personales recolectados.”</w:t>
       </w:r>
     </w:p>
@@ -6433,7 +6547,7 @@
     </w:p>
     <w:p>
       <w:pPr>
-        <w:pStyle w:val="Prrafodelista"/>
+        <w:pStyle w:val="ListParagraph"/>
         <w:numPr>
           <w:ilvl w:val="0"/>
           <w:numId w:val="1"/>
@@ -6653,7 +6767,7 @@
 <w:ftr xmlns:wpc="http://schemas.microsoft.com/office/word/2010/wordprocessingCanvas" xmlns:cx="http://schemas.microsoft.com/office/drawing/2014/chartex" xmlns:cx1="http://schemas.microsoft.com/office/drawing/2015/9/8/chartex" xmlns:cx2="http://schemas.microsoft.com/office/drawing/2015/10/21/chartex" xmlns:cx3="http://schemas.microsoft.com/office/drawing/2016/5/9/chartex" xmlns:cx4="http://schemas.microsoft.com/office/drawing/2016/5/10/chartex" xmlns:cx5="http://schemas.microsoft.com/office/drawing/2016/5/11/chartex" xmlns:cx6="http://schemas.microsoft.com/office/drawing/2016/5/12/chartex" xmlns:cx7="http://schemas.microsoft.com/office/drawing/2016/5/13/chartex" xmlns:cx8="http://schemas.microsoft.com/office/drawing/2016/5/14/chartex" xmlns:mc="http://schemas.openxmlformats.org/markup-compatibility/2006" xmlns:aink="http://schemas.microsoft.com/office/drawing/2016/ink" xmlns:am3d="http://schemas.microsoft.com/office/drawing/2017/model3d" xmlns:o="urn:schemas-microsoft-com:office:office" xmlns:oel="http://schemas.microsoft.com/office/2019/extlst" xmlns:r="http://schemas.openxmlformats.org/officeDocument/2006/relationships" xmlns:m="http://schemas.openxmlformats.org/officeDocument/2006/math" xmlns:v="urn:schemas-microsoft-com:vml" xmlns:wp14="http://schemas.microsoft.com/office/word/2010/wordprocessingDrawing" xmlns:wp="http://schemas.openxmlformats.org/drawingml/2006/wordprocessingDrawing" xmlns:w10="urn:schemas-microsoft-com:office:word" xmlns:w="http://schemas.openxmlformats.org/wordprocessingml/2006/main" xmlns:w14="http://schemas.microsoft.com/office/word/2010/wordml" xmlns:w15="http://schemas.microsoft.com/office/word/2012/wordml" xmlns:w16cex="http://schemas.microsoft.com/office/word/2018/wordml/cex" xmlns:w16cid="http://schemas.microsoft.com/office/word/2016/wordml/cid" xmlns:w16="http://schemas.microsoft.com/office/word/2018/wordml" xmlns:w16du="http://schemas.microsoft.com/office/word/2023/wordml/word16du" xmlns:w16sdtdh="http://schemas.microsoft.com/office/word/2020/wordml/sdtdatahash" xmlns:w16sdtfl="http://schemas.microsoft.com/office/word/2024/wordml/sdtformatlock" xmlns:w16se="http://schemas.microsoft.com/office/word/2015/wordml/symex" xmlns:wpg="http://schemas.microsoft.com/office/word/2010/wordprocessingGroup" xmlns:wpi="http://schemas.microsoft.com/office/word/2010/wordprocessingInk" xmlns:wne="http://schemas.microsoft.com/office/word/2006/wordml" xmlns:wps="http://schemas.microsoft.com/office/word/2010/wordprocessingShape" mc:Ignorable="w14 w15 w16se w16cid w16 w16cex w16sdtdh w16sdtfl w16du wp14">
   <w:p>
     <w:pPr>
-      <w:pStyle w:val="Piedepgina"/>
+      <w:pStyle w:val="Footer"/>
     </w:pPr>
     <w:sdt>
       <w:sdtPr>
@@ -6730,7 +6844,7 @@
     <w:sdtContent>
       <w:p>
         <w:pPr>
-          <w:pStyle w:val="Piedepgina"/>
+          <w:pStyle w:val="Footer"/>
           <w:spacing w:after="0" w:line="360" w:lineRule="auto"/>
           <w:jc w:val="right"/>
           <w:rPr>
@@ -6786,7 +6900,7 @@
   </w:sdt>
   <w:p>
     <w:pPr>
-      <w:pStyle w:val="Piedepgina"/>
+      <w:pStyle w:val="Footer"/>
       <w:spacing w:after="0" w:line="360" w:lineRule="auto"/>
       <w:jc w:val="center"/>
       <w:rPr>
@@ -6854,7 +6968,7 @@
   </w:p>
   <w:p>
     <w:pPr>
-      <w:pStyle w:val="Piedepgina"/>
+      <w:pStyle w:val="Footer"/>
       <w:spacing w:after="0" w:line="360" w:lineRule="auto"/>
       <w:jc w:val="center"/>
       <w:rPr>
@@ -6866,7 +6980,7 @@
   </w:p>
   <w:p>
     <w:pPr>
-      <w:pStyle w:val="Piedepgina"/>
+      <w:pStyle w:val="Footer"/>
       <w:spacing w:after="0" w:line="360" w:lineRule="auto"/>
       <w:jc w:val="center"/>
       <w:rPr>
@@ -6908,7 +7022,7 @@
 <w:hdr xmlns:wpc="http://schemas.microsoft.com/office/word/2010/wordprocessingCanvas" xmlns:cx="http://schemas.microsoft.com/office/drawing/2014/chartex" xmlns:cx1="http://schemas.microsoft.com/office/drawing/2015/9/8/chartex" xmlns:cx2="http://schemas.microsoft.com/office/drawing/2015/10/21/chartex" xmlns:cx3="http://schemas.microsoft.com/office/drawing/2016/5/9/chartex" xmlns:cx4="http://schemas.microsoft.com/office/drawing/2016/5/10/chartex" xmlns:cx5="http://schemas.microsoft.com/office/drawing/2016/5/11/chartex" xmlns:cx6="http://schemas.microsoft.com/office/drawing/2016/5/12/chartex" xmlns:cx7="http://schemas.microsoft.com/office/drawing/2016/5/13/chartex" xmlns:cx8="http://schemas.microsoft.com/office/drawing/2016/5/14/chartex" xmlns:mc="http://schemas.openxmlformats.org/markup-compatibility/2006" xmlns:aink="http://schemas.microsoft.com/office/drawing/2016/ink" xmlns:am3d="http://schemas.microsoft.com/office/drawing/2017/model3d" xmlns:o="urn:schemas-microsoft-com:office:office" xmlns:oel="http://schemas.microsoft.com/office/2019/extlst" xmlns:r="http://schemas.openxmlformats.org/officeDocument/2006/relationships" xmlns:m="http://schemas.openxmlformats.org/officeDocument/2006/math" xmlns:v="urn:schemas-microsoft-com:vml" xmlns:wp14="http://schemas.microsoft.com/office/word/2010/wordprocessingDrawing" xmlns:wp="http://schemas.openxmlformats.org/drawingml/2006/wordprocessingDrawing" xmlns:w10="urn:schemas-microsoft-com:office:word" xmlns:w="http://schemas.openxmlformats.org/wordprocessingml/2006/main" xmlns:w14="http://schemas.microsoft.com/office/word/2010/wordml" xmlns:w15="http://schemas.microsoft.com/office/word/2012/wordml" xmlns:w16cex="http://schemas.microsoft.com/office/word/2018/wordml/cex" xmlns:w16cid="http://schemas.microsoft.com/office/word/2016/wordml/cid" xmlns:w16="http://schemas.microsoft.com/office/word/2018/wordml" xmlns:w16du="http://schemas.microsoft.com/office/word/2023/wordml/word16du" xmlns:w16sdtdh="http://schemas.microsoft.com/office/word/2020/wordml/sdtdatahash" xmlns:w16sdtfl="http://schemas.microsoft.com/office/word/2024/wordml/sdtformatlock" xmlns:w16se="http://schemas.microsoft.com/office/word/2015/wordml/symex" xmlns:wpg="http://schemas.microsoft.com/office/word/2010/wordprocessingGroup" xmlns:wpi="http://schemas.microsoft.com/office/word/2010/wordprocessingInk" xmlns:wne="http://schemas.microsoft.com/office/word/2006/wordml" xmlns:wps="http://schemas.microsoft.com/office/word/2010/wordprocessingShape" mc:Ignorable="w14 w15 w16se w16cid w16 w16cex w16sdtdh w16sdtfl w16du wp14">
   <w:p>
     <w:pPr>
-      <w:pStyle w:val="Encabezado"/>
+      <w:pStyle w:val="Header"/>
     </w:pPr>
     <w:sdt>
       <w:sdtPr>
@@ -6973,7 +7087,7 @@
   </w:p>
   <w:p>
     <w:pPr>
-      <w:pStyle w:val="Encabezado"/>
+      <w:pStyle w:val="Header"/>
     </w:pPr>
   </w:p>
 </w:hdr>
@@ -6983,7 +7097,7 @@
 <w:hdr xmlns:wpc="http://schemas.microsoft.com/office/word/2010/wordprocessingCanvas" xmlns:cx="http://schemas.microsoft.com/office/drawing/2014/chartex" xmlns:cx1="http://schemas.microsoft.com/office/drawing/2015/9/8/chartex" xmlns:cx2="http://schemas.microsoft.com/office/drawing/2015/10/21/chartex" xmlns:cx3="http://schemas.microsoft.com/office/drawing/2016/5/9/chartex" xmlns:cx4="http://schemas.microsoft.com/office/drawing/2016/5/10/chartex" xmlns:cx5="http://schemas.microsoft.com/office/drawing/2016/5/11/chartex" xmlns:cx6="http://schemas.microsoft.com/office/drawing/2016/5/12/chartex" xmlns:cx7="http://schemas.microsoft.com/office/drawing/2016/5/13/chartex" xmlns:cx8="http://schemas.microsoft.com/office/drawing/2016/5/14/chartex" xmlns:mc="http://schemas.openxmlformats.org/markup-compatibility/2006" xmlns:aink="http://schemas.microsoft.com/office/drawing/2016/ink" xmlns:am3d="http://schemas.microsoft.com/office/drawing/2017/model3d" xmlns:o="urn:schemas-microsoft-com:office:office" xmlns:oel="http://schemas.microsoft.com/office/2019/extlst" xmlns:r="http://schemas.openxmlformats.org/officeDocument/2006/relationships" xmlns:m="http://schemas.openxmlformats.org/officeDocument/2006/math" xmlns:v="urn:schemas-microsoft-com:vml" xmlns:wp14="http://schemas.microsoft.com/office/word/2010/wordprocessingDrawing" xmlns:wp="http://schemas.openxmlformats.org/drawingml/2006/wordprocessingDrawing" xmlns:w10="urn:schemas-microsoft-com:office:word" xmlns:w="http://schemas.openxmlformats.org/wordprocessingml/2006/main" xmlns:w14="http://schemas.microsoft.com/office/word/2010/wordml" xmlns:w15="http://schemas.microsoft.com/office/word/2012/wordml" xmlns:w16cex="http://schemas.microsoft.com/office/word/2018/wordml/cex" xmlns:w16cid="http://schemas.microsoft.com/office/word/2016/wordml/cid" xmlns:w16="http://schemas.microsoft.com/office/word/2018/wordml" xmlns:w16du="http://schemas.microsoft.com/office/word/2023/wordml/word16du" xmlns:w16sdtdh="http://schemas.microsoft.com/office/word/2020/wordml/sdtdatahash" xmlns:w16sdtfl="http://schemas.microsoft.com/office/word/2024/wordml/sdtformatlock" xmlns:w16se="http://schemas.microsoft.com/office/word/2015/wordml/symex" xmlns:wpg="http://schemas.microsoft.com/office/word/2010/wordprocessingGroup" xmlns:wpi="http://schemas.microsoft.com/office/word/2010/wordprocessingInk" xmlns:wne="http://schemas.microsoft.com/office/word/2006/wordml" xmlns:wps="http://schemas.microsoft.com/office/word/2010/wordprocessingShape" mc:Ignorable="w14 w15 w16se w16cid w16 w16cex w16sdtdh w16sdtfl w16du wp14">
   <w:p>
     <w:pPr>
-      <w:pStyle w:val="Encabezado"/>
+      <w:pStyle w:val="Header"/>
       <w:jc w:val="center"/>
     </w:pPr>
     <w:r>
@@ -11175,11 +11289,11 @@
       <w:lang w:eastAsia="en-US"/>
     </w:rPr>
   </w:style>
-  <w:style w:type="paragraph" w:styleId="Ttulo1">
+  <w:style w:type="paragraph" w:styleId="Heading1">
     <w:name w:val="heading 1"/>
     <w:basedOn w:val="Normal"/>
     <w:next w:val="Normal"/>
-    <w:link w:val="Ttulo1Car"/>
+    <w:link w:val="Heading1Char"/>
     <w:uiPriority w:val="9"/>
     <w:qFormat/>
     <w:rsid w:val="00115DB7"/>
@@ -11193,11 +11307,11 @@
       <w:szCs w:val="24"/>
     </w:rPr>
   </w:style>
-  <w:style w:type="paragraph" w:styleId="Ttulo2">
+  <w:style w:type="paragraph" w:styleId="Heading2">
     <w:name w:val="heading 2"/>
     <w:basedOn w:val="Normal"/>
     <w:next w:val="Normal"/>
-    <w:link w:val="Ttulo2Car"/>
+    <w:link w:val="Heading2Char"/>
     <w:uiPriority w:val="9"/>
     <w:unhideWhenUsed/>
     <w:qFormat/>
@@ -11215,11 +11329,11 @@
       <w:szCs w:val="24"/>
     </w:rPr>
   </w:style>
-  <w:style w:type="paragraph" w:styleId="Ttulo3">
+  <w:style w:type="paragraph" w:styleId="Heading3">
     <w:name w:val="heading 3"/>
     <w:basedOn w:val="Normal"/>
     <w:next w:val="Normal"/>
-    <w:link w:val="Ttulo3Car"/>
+    <w:link w:val="Heading3Char"/>
     <w:uiPriority w:val="9"/>
     <w:unhideWhenUsed/>
     <w:qFormat/>
@@ -11238,13 +11352,13 @@
       <w:szCs w:val="24"/>
     </w:rPr>
   </w:style>
-  <w:style w:type="character" w:default="1" w:styleId="Fuentedeprrafopredeter">
+  <w:style w:type="character" w:default="1" w:styleId="DefaultParagraphFont">
     <w:name w:val="Default Paragraph Font"/>
     <w:uiPriority w:val="1"/>
     <w:semiHidden/>
     <w:unhideWhenUsed/>
   </w:style>
-  <w:style w:type="table" w:default="1" w:styleId="Tablanormal">
+  <w:style w:type="table" w:default="1" w:styleId="TableNormal">
     <w:name w:val="Normal Table"/>
     <w:uiPriority w:val="99"/>
     <w:semiHidden/>
@@ -11259,16 +11373,16 @@
       </w:tblCellMar>
     </w:tblPr>
   </w:style>
-  <w:style w:type="numbering" w:default="1" w:styleId="Sinlista">
+  <w:style w:type="numbering" w:default="1" w:styleId="NoList">
     <w:name w:val="No List"/>
     <w:uiPriority w:val="99"/>
     <w:semiHidden/>
     <w:unhideWhenUsed/>
   </w:style>
-  <w:style w:type="paragraph" w:styleId="Encabezado">
+  <w:style w:type="paragraph" w:styleId="Header">
     <w:name w:val="header"/>
     <w:basedOn w:val="Normal"/>
-    <w:link w:val="EncabezadoCar"/>
+    <w:link w:val="HeaderChar"/>
     <w:uiPriority w:val="99"/>
     <w:unhideWhenUsed/>
     <w:rsid w:val="001A74F0"/>
@@ -11279,17 +11393,17 @@
       </w:tabs>
     </w:pPr>
   </w:style>
-  <w:style w:type="character" w:customStyle="1" w:styleId="EncabezadoCar">
-    <w:name w:val="Encabezado Car"/>
-    <w:basedOn w:val="Fuentedeprrafopredeter"/>
-    <w:link w:val="Encabezado"/>
+  <w:style w:type="character" w:customStyle="1" w:styleId="HeaderChar">
+    <w:name w:val="Header Char"/>
+    <w:basedOn w:val="DefaultParagraphFont"/>
+    <w:link w:val="Header"/>
     <w:uiPriority w:val="99"/>
     <w:rsid w:val="001A74F0"/>
   </w:style>
-  <w:style w:type="paragraph" w:styleId="Piedepgina">
+  <w:style w:type="paragraph" w:styleId="Footer">
     <w:name w:val="footer"/>
     <w:basedOn w:val="Normal"/>
-    <w:link w:val="PiedepginaCar"/>
+    <w:link w:val="FooterChar"/>
     <w:uiPriority w:val="99"/>
     <w:unhideWhenUsed/>
     <w:rsid w:val="001A74F0"/>
@@ -11300,18 +11414,18 @@
       </w:tabs>
     </w:pPr>
   </w:style>
-  <w:style w:type="character" w:customStyle="1" w:styleId="PiedepginaCar">
-    <w:name w:val="Pie de página Car"/>
-    <w:basedOn w:val="Fuentedeprrafopredeter"/>
-    <w:link w:val="Piedepgina"/>
+  <w:style w:type="character" w:customStyle="1" w:styleId="FooterChar">
+    <w:name w:val="Footer Char"/>
+    <w:basedOn w:val="DefaultParagraphFont"/>
+    <w:link w:val="Footer"/>
     <w:uiPriority w:val="99"/>
     <w:rsid w:val="001A74F0"/>
   </w:style>
-  <w:style w:type="paragraph" w:styleId="Prrafodelista">
+  <w:style w:type="paragraph" w:styleId="ListParagraph">
     <w:name w:val="List Paragraph"/>
     <w:aliases w:val="Llista Nivell1,titulo 3,Bullets,Párrafo de lista1,Segundo nivel de viñetas,List Paragraph1"/>
     <w:basedOn w:val="Normal"/>
-    <w:link w:val="PrrafodelistaCar"/>
+    <w:link w:val="ListParagraphChar"/>
     <w:uiPriority w:val="34"/>
     <w:qFormat/>
     <w:rsid w:val="001A74F0"/>
@@ -11320,10 +11434,10 @@
       <w:contextualSpacing/>
     </w:pPr>
   </w:style>
-  <w:style w:type="paragraph" w:styleId="Textodeglobo">
+  <w:style w:type="paragraph" w:styleId="BalloonText">
     <w:name w:val="Balloon Text"/>
     <w:basedOn w:val="Normal"/>
-    <w:link w:val="TextodegloboCar"/>
+    <w:link w:val="BalloonTextChar"/>
     <w:uiPriority w:val="99"/>
     <w:semiHidden/>
     <w:unhideWhenUsed/>
@@ -11337,10 +11451,10 @@
       <w:szCs w:val="18"/>
     </w:rPr>
   </w:style>
-  <w:style w:type="character" w:customStyle="1" w:styleId="TextodegloboCar">
-    <w:name w:val="Texto de globo Car"/>
-    <w:basedOn w:val="Fuentedeprrafopredeter"/>
-    <w:link w:val="Textodeglobo"/>
+  <w:style w:type="character" w:customStyle="1" w:styleId="BalloonTextChar">
+    <w:name w:val="Balloon Text Char"/>
+    <w:basedOn w:val="DefaultParagraphFont"/>
+    <w:link w:val="BalloonText"/>
     <w:uiPriority w:val="99"/>
     <w:semiHidden/>
     <w:rsid w:val="00ED6D30"/>
@@ -11351,10 +11465,10 @@
       <w:lang w:eastAsia="en-US"/>
     </w:rPr>
   </w:style>
-  <w:style w:type="paragraph" w:styleId="Textosinformato">
+  <w:style w:type="paragraph" w:styleId="PlainText">
     <w:name w:val="Plain Text"/>
     <w:basedOn w:val="Normal"/>
-    <w:link w:val="TextosinformatoCar"/>
+    <w:link w:val="PlainTextChar"/>
     <w:uiPriority w:val="99"/>
     <w:semiHidden/>
     <w:unhideWhenUsed/>
@@ -11367,10 +11481,10 @@
       <w:szCs w:val="21"/>
     </w:rPr>
   </w:style>
-  <w:style w:type="character" w:customStyle="1" w:styleId="TextosinformatoCar">
-    <w:name w:val="Texto sin formato Car"/>
-    <w:basedOn w:val="Fuentedeprrafopredeter"/>
-    <w:link w:val="Textosinformato"/>
+  <w:style w:type="character" w:customStyle="1" w:styleId="PlainTextChar">
+    <w:name w:val="Plain Text Char"/>
+    <w:basedOn w:val="DefaultParagraphFont"/>
+    <w:link w:val="PlainText"/>
     <w:uiPriority w:val="99"/>
     <w:semiHidden/>
     <w:rsid w:val="001A6548"/>
@@ -11381,10 +11495,10 @@
       <w:lang w:eastAsia="en-US"/>
     </w:rPr>
   </w:style>
-  <w:style w:type="character" w:customStyle="1" w:styleId="Ttulo1Car">
-    <w:name w:val="Título 1 Car"/>
-    <w:basedOn w:val="Fuentedeprrafopredeter"/>
-    <w:link w:val="Ttulo1"/>
+  <w:style w:type="character" w:customStyle="1" w:styleId="Heading1Char">
+    <w:name w:val="Heading 1 Char"/>
+    <w:basedOn w:val="DefaultParagraphFont"/>
+    <w:link w:val="Heading1"/>
     <w:uiPriority w:val="9"/>
     <w:rsid w:val="00115DB7"/>
     <w:rPr>
@@ -11393,10 +11507,10 @@
       <w:lang w:eastAsia="en-US"/>
     </w:rPr>
   </w:style>
-  <w:style w:type="character" w:customStyle="1" w:styleId="Ttulo2Car">
-    <w:name w:val="Título 2 Car"/>
-    <w:basedOn w:val="Fuentedeprrafopredeter"/>
-    <w:link w:val="Ttulo2"/>
+  <w:style w:type="character" w:customStyle="1" w:styleId="Heading2Char">
+    <w:name w:val="Heading 2 Char"/>
+    <w:basedOn w:val="DefaultParagraphFont"/>
+    <w:link w:val="Heading2"/>
     <w:uiPriority w:val="9"/>
     <w:rsid w:val="0096518A"/>
     <w:rPr>
@@ -11406,7 +11520,7 @@
       <w:lang w:eastAsia="en-US"/>
     </w:rPr>
   </w:style>
-  <w:style w:type="paragraph" w:styleId="TDC1">
+  <w:style w:type="paragraph" w:styleId="TOC1">
     <w:name w:val="toc 1"/>
     <w:basedOn w:val="Normal"/>
     <w:next w:val="Normal"/>
@@ -11422,9 +11536,9 @@
       <w:spacing w:after="100"/>
     </w:pPr>
   </w:style>
-  <w:style w:type="character" w:styleId="Hipervnculo">
+  <w:style w:type="character" w:styleId="Hyperlink">
     <w:name w:val="Hyperlink"/>
-    <w:basedOn w:val="Fuentedeprrafopredeter"/>
+    <w:basedOn w:val="DefaultParagraphFont"/>
     <w:uiPriority w:val="99"/>
     <w:unhideWhenUsed/>
     <w:rsid w:val="00BB4039"/>
@@ -11433,9 +11547,9 @@
       <w:u w:val="single"/>
     </w:rPr>
   </w:style>
-  <w:style w:type="paragraph" w:styleId="Sinespaciado">
+  <w:style w:type="paragraph" w:styleId="NoSpacing">
     <w:name w:val="No Spacing"/>
-    <w:link w:val="SinespaciadoCar"/>
+    <w:link w:val="NoSpacingChar"/>
     <w:uiPriority w:val="1"/>
     <w:qFormat/>
     <w:rsid w:val="00BB4039"/>
@@ -11445,10 +11559,10 @@
       <w:lang w:eastAsia="es-CO"/>
     </w:rPr>
   </w:style>
-  <w:style w:type="character" w:customStyle="1" w:styleId="SinespaciadoCar">
-    <w:name w:val="Sin espaciado Car"/>
-    <w:basedOn w:val="Fuentedeprrafopredeter"/>
-    <w:link w:val="Sinespaciado"/>
+  <w:style w:type="character" w:customStyle="1" w:styleId="NoSpacingChar">
+    <w:name w:val="No Spacing Char"/>
+    <w:basedOn w:val="DefaultParagraphFont"/>
+    <w:link w:val="NoSpacing"/>
     <w:uiPriority w:val="1"/>
     <w:rsid w:val="00BB4039"/>
     <w:rPr>
@@ -11457,10 +11571,10 @@
       <w:lang w:eastAsia="es-CO"/>
     </w:rPr>
   </w:style>
-  <w:style w:type="character" w:customStyle="1" w:styleId="PrrafodelistaCar">
-    <w:name w:val="Párrafo de lista Car"/>
-    <w:aliases w:val="Llista Nivell1 Car,titulo 3 Car,Bullets Car,Párrafo de lista1 Car,Segundo nivel de viñetas Car,List Paragraph1 Car"/>
-    <w:link w:val="Prrafodelista"/>
+  <w:style w:type="character" w:customStyle="1" w:styleId="ListParagraphChar">
+    <w:name w:val="List Paragraph Char"/>
+    <w:aliases w:val="Llista Nivell1 Char,titulo 3 Char,Bullets Char,Párrafo de lista1 Char,Segundo nivel de viñetas Char,List Paragraph1 Char"/>
+    <w:link w:val="ListParagraph"/>
     <w:uiPriority w:val="34"/>
     <w:rsid w:val="00C968E6"/>
     <w:rPr>
@@ -11470,9 +11584,9 @@
       <w:lang w:eastAsia="en-US"/>
     </w:rPr>
   </w:style>
-  <w:style w:type="table" w:styleId="Tablaconcuadrcula">
+  <w:style w:type="table" w:styleId="TableGrid">
     <w:name w:val="Table Grid"/>
-    <w:basedOn w:val="Tablanormal"/>
+    <w:basedOn w:val="TableNormal"/>
     <w:uiPriority w:val="39"/>
     <w:rsid w:val="00C968E6"/>
     <w:rPr>
@@ -11491,10 +11605,10 @@
       </w:tblBorders>
     </w:tblPr>
   </w:style>
-  <w:style w:type="character" w:customStyle="1" w:styleId="Ttulo3Car">
-    <w:name w:val="Título 3 Car"/>
-    <w:basedOn w:val="Fuentedeprrafopredeter"/>
-    <w:link w:val="Ttulo3"/>
+  <w:style w:type="character" w:customStyle="1" w:styleId="Heading3Char">
+    <w:name w:val="Heading 3 Char"/>
+    <w:basedOn w:val="DefaultParagraphFont"/>
+    <w:link w:val="Heading3"/>
     <w:uiPriority w:val="9"/>
     <w:rsid w:val="0096518A"/>
     <w:rPr>
@@ -11506,7 +11620,7 @@
       <w:lang w:eastAsia="en-US"/>
     </w:rPr>
   </w:style>
-  <w:style w:type="paragraph" w:styleId="TDC2">
+  <w:style w:type="paragraph" w:styleId="TOC2">
     <w:name w:val="toc 2"/>
     <w:basedOn w:val="Normal"/>
     <w:next w:val="Normal"/>
@@ -11519,7 +11633,7 @@
       <w:ind w:left="220"/>
     </w:pPr>
   </w:style>
-  <w:style w:type="paragraph" w:styleId="Descripcin">
+  <w:style w:type="paragraph" w:styleId="Caption">
     <w:name w:val="caption"/>
     <w:basedOn w:val="Normal"/>
     <w:next w:val="Normal"/>
@@ -11538,10 +11652,10 @@
       <w:szCs w:val="18"/>
     </w:rPr>
   </w:style>
-  <w:style w:type="paragraph" w:styleId="Textonotapie">
+  <w:style w:type="paragraph" w:styleId="FootnoteText">
     <w:name w:val="footnote text"/>
     <w:basedOn w:val="Normal"/>
-    <w:link w:val="TextonotapieCar"/>
+    <w:link w:val="FootnoteTextChar"/>
     <w:uiPriority w:val="99"/>
     <w:semiHidden/>
     <w:unhideWhenUsed/>
@@ -11554,10 +11668,10 @@
       <w:szCs w:val="20"/>
     </w:rPr>
   </w:style>
-  <w:style w:type="character" w:customStyle="1" w:styleId="TextonotapieCar">
-    <w:name w:val="Texto nota pie Car"/>
-    <w:basedOn w:val="Fuentedeprrafopredeter"/>
-    <w:link w:val="Textonotapie"/>
+  <w:style w:type="character" w:customStyle="1" w:styleId="FootnoteTextChar">
+    <w:name w:val="Footnote Text Char"/>
+    <w:basedOn w:val="DefaultParagraphFont"/>
+    <w:link w:val="FootnoteText"/>
     <w:uiPriority w:val="99"/>
     <w:semiHidden/>
     <w:rsid w:val="00DA7FED"/>
@@ -11568,9 +11682,9 @@
       <w:lang w:eastAsia="en-US"/>
     </w:rPr>
   </w:style>
-  <w:style w:type="character" w:styleId="Refdenotaalpie">
+  <w:style w:type="character" w:styleId="FootnoteReference">
     <w:name w:val="footnote reference"/>
-    <w:basedOn w:val="Fuentedeprrafopredeter"/>
+    <w:basedOn w:val="DefaultParagraphFont"/>
     <w:uiPriority w:val="99"/>
     <w:semiHidden/>
     <w:unhideWhenUsed/>
@@ -11581,7 +11695,7 @@
   </w:style>
   <w:style w:type="character" w:customStyle="1" w:styleId="Mencinsinresolver1">
     <w:name w:val="Mención sin resolver1"/>
-    <w:basedOn w:val="Fuentedeprrafopredeter"/>
+    <w:basedOn w:val="DefaultParagraphFont"/>
     <w:uiPriority w:val="99"/>
     <w:semiHidden/>
     <w:unhideWhenUsed/>
@@ -11591,9 +11705,9 @@
       <w:shd w:val="clear" w:color="auto" w:fill="E1DFDD"/>
     </w:rPr>
   </w:style>
-  <w:style w:type="character" w:styleId="Hipervnculovisitado">
+  <w:style w:type="character" w:styleId="FollowedHyperlink">
     <w:name w:val="FollowedHyperlink"/>
-    <w:basedOn w:val="Fuentedeprrafopredeter"/>
+    <w:basedOn w:val="DefaultParagraphFont"/>
     <w:uiPriority w:val="99"/>
     <w:semiHidden/>
     <w:unhideWhenUsed/>
@@ -11603,19 +11717,19 @@
       <w:u w:val="single"/>
     </w:rPr>
   </w:style>
-  <w:style w:type="paragraph" w:styleId="Saludo">
+  <w:style w:type="paragraph" w:styleId="Salutation">
     <w:name w:val="Salutation"/>
     <w:basedOn w:val="Normal"/>
     <w:next w:val="Normal"/>
-    <w:link w:val="SaludoCar"/>
+    <w:link w:val="SalutationChar"/>
     <w:uiPriority w:val="99"/>
     <w:unhideWhenUsed/>
     <w:rsid w:val="007A57F9"/>
   </w:style>
-  <w:style w:type="character" w:customStyle="1" w:styleId="SaludoCar">
-    <w:name w:val="Saludo Car"/>
-    <w:basedOn w:val="Fuentedeprrafopredeter"/>
-    <w:link w:val="Saludo"/>
+  <w:style w:type="character" w:customStyle="1" w:styleId="SalutationChar">
+    <w:name w:val="Salutation Char"/>
+    <w:basedOn w:val="DefaultParagraphFont"/>
+    <w:link w:val="Salutation"/>
     <w:uiPriority w:val="99"/>
     <w:rsid w:val="007A57F9"/>
     <w:rPr>
@@ -11625,10 +11739,10 @@
       <w:lang w:eastAsia="en-US"/>
     </w:rPr>
   </w:style>
-  <w:style w:type="paragraph" w:styleId="Textoindependiente">
+  <w:style w:type="paragraph" w:styleId="BodyText">
     <w:name w:val="Body Text"/>
     <w:basedOn w:val="Normal"/>
-    <w:link w:val="TextoindependienteCar"/>
+    <w:link w:val="BodyTextChar"/>
     <w:uiPriority w:val="99"/>
     <w:unhideWhenUsed/>
     <w:rsid w:val="007A57F9"/>
@@ -11636,10 +11750,10 @@
       <w:spacing w:after="120"/>
     </w:pPr>
   </w:style>
-  <w:style w:type="character" w:customStyle="1" w:styleId="TextoindependienteCar">
-    <w:name w:val="Texto independiente Car"/>
-    <w:basedOn w:val="Fuentedeprrafopredeter"/>
-    <w:link w:val="Textoindependiente"/>
+  <w:style w:type="character" w:customStyle="1" w:styleId="BodyTextChar">
+    <w:name w:val="Body Text Char"/>
+    <w:basedOn w:val="DefaultParagraphFont"/>
+    <w:link w:val="BodyText"/>
     <w:uiPriority w:val="99"/>
     <w:rsid w:val="007A57F9"/>
     <w:rPr>
@@ -11649,10 +11763,10 @@
       <w:lang w:eastAsia="en-US"/>
     </w:rPr>
   </w:style>
-  <w:style w:type="paragraph" w:styleId="Sangradetextonormal">
+  <w:style w:type="paragraph" w:styleId="BodyTextIndent">
     <w:name w:val="Body Text Indent"/>
     <w:basedOn w:val="Normal"/>
-    <w:link w:val="SangradetextonormalCar"/>
+    <w:link w:val="BodyTextIndentChar"/>
     <w:uiPriority w:val="99"/>
     <w:semiHidden/>
     <w:unhideWhenUsed/>
@@ -11662,10 +11776,10 @@
       <w:ind w:left="283"/>
     </w:pPr>
   </w:style>
-  <w:style w:type="character" w:customStyle="1" w:styleId="SangradetextonormalCar">
-    <w:name w:val="Sangría de texto normal Car"/>
-    <w:basedOn w:val="Fuentedeprrafopredeter"/>
-    <w:link w:val="Sangradetextonormal"/>
+  <w:style w:type="character" w:customStyle="1" w:styleId="BodyTextIndentChar">
+    <w:name w:val="Body Text Indent Char"/>
+    <w:basedOn w:val="DefaultParagraphFont"/>
+    <w:link w:val="BodyTextIndent"/>
     <w:uiPriority w:val="99"/>
     <w:semiHidden/>
     <w:rsid w:val="007A57F9"/>
@@ -11676,10 +11790,10 @@
       <w:lang w:eastAsia="en-US"/>
     </w:rPr>
   </w:style>
-  <w:style w:type="paragraph" w:styleId="Textoindependienteprimerasangra2">
+  <w:style w:type="paragraph" w:styleId="BodyTextFirstIndent2">
     <w:name w:val="Body Text First Indent 2"/>
-    <w:basedOn w:val="Sangradetextonormal"/>
-    <w:link w:val="Textoindependienteprimerasangra2Car"/>
+    <w:basedOn w:val="BodyTextIndent"/>
+    <w:link w:val="BodyTextFirstIndent2Char"/>
     <w:uiPriority w:val="99"/>
     <w:unhideWhenUsed/>
     <w:rsid w:val="007A57F9"/>
@@ -11688,10 +11802,10 @@
       <w:ind w:left="360" w:firstLine="360"/>
     </w:pPr>
   </w:style>
-  <w:style w:type="character" w:customStyle="1" w:styleId="Textoindependienteprimerasangra2Car">
-    <w:name w:val="Texto independiente primera sangría 2 Car"/>
-    <w:basedOn w:val="SangradetextonormalCar"/>
-    <w:link w:val="Textoindependienteprimerasangra2"/>
+  <w:style w:type="character" w:customStyle="1" w:styleId="BodyTextFirstIndent2Char">
+    <w:name w:val="Body Text First Indent 2 Char"/>
+    <w:basedOn w:val="BodyTextIndentChar"/>
+    <w:link w:val="BodyTextFirstIndent2"/>
     <w:uiPriority w:val="99"/>
     <w:rsid w:val="007A57F9"/>
     <w:rPr>
@@ -11701,7 +11815,7 @@
       <w:lang w:eastAsia="en-US"/>
     </w:rPr>
   </w:style>
-  <w:style w:type="paragraph" w:styleId="TDC3">
+  <w:style w:type="paragraph" w:styleId="TOC3">
     <w:name w:val="toc 3"/>
     <w:basedOn w:val="Normal"/>
     <w:next w:val="Normal"/>
@@ -11714,7 +11828,7 @@
       <w:ind w:left="440"/>
     </w:pPr>
   </w:style>
-  <w:style w:type="paragraph" w:styleId="Tabladeilustraciones">
+  <w:style w:type="paragraph" w:styleId="TableofFigures">
     <w:name w:val="table of figures"/>
     <w:basedOn w:val="Normal"/>
     <w:next w:val="Normal"/>
@@ -11762,10 +11876,10 @@
       <w:lang w:eastAsia="es-CO"/>
     </w:rPr>
   </w:style>
-  <w:style w:type="paragraph" w:styleId="Textocomentario">
+  <w:style w:type="paragraph" w:styleId="CommentText">
     <w:name w:val="annotation text"/>
     <w:basedOn w:val="Normal"/>
-    <w:link w:val="TextocomentarioCar"/>
+    <w:link w:val="CommentTextChar"/>
     <w:uiPriority w:val="99"/>
     <w:unhideWhenUsed/>
     <w:rsid w:val="00C93984"/>
@@ -11787,10 +11901,10 @@
       <w:lang w:eastAsia="es-ES"/>
     </w:rPr>
   </w:style>
-  <w:style w:type="character" w:customStyle="1" w:styleId="TextocomentarioCar">
-    <w:name w:val="Texto comentario Car"/>
-    <w:basedOn w:val="Fuentedeprrafopredeter"/>
-    <w:link w:val="Textocomentario"/>
+  <w:style w:type="character" w:customStyle="1" w:styleId="CommentTextChar">
+    <w:name w:val="Comment Text Char"/>
+    <w:basedOn w:val="DefaultParagraphFont"/>
+    <w:link w:val="CommentText"/>
     <w:uiPriority w:val="99"/>
     <w:rsid w:val="00C93984"/>
     <w:rPr>
@@ -11800,9 +11914,9 @@
       <w:szCs w:val="20"/>
     </w:rPr>
   </w:style>
-  <w:style w:type="table" w:styleId="Tabladecuadrcula4">
+  <w:style w:type="table" w:styleId="GridTable4">
     <w:name w:val="Grid Table 4"/>
-    <w:basedOn w:val="Tablanormal"/>
+    <w:basedOn w:val="TableNormal"/>
     <w:uiPriority w:val="49"/>
     <w:rsid w:val="00EF02F2"/>
     <w:pPr>
@@ -12103,7 +12217,9 @@
     <w:rsid w:val="003F7E31"/>
     <w:rsid w:val="0040381B"/>
     <w:rsid w:val="004210E3"/>
+    <w:rsid w:val="00583516"/>
     <w:rsid w:val="00633778"/>
+    <w:rsid w:val="006F5FC9"/>
     <w:rsid w:val="00700CED"/>
     <w:rsid w:val="008407BD"/>
     <w:rsid w:val="008A612A"/>
@@ -12537,13 +12653,13 @@
     <w:name w:val="Normal"/>
     <w:qFormat/>
   </w:style>
-  <w:style w:type="character" w:default="1" w:styleId="Fuentedeprrafopredeter">
+  <w:style w:type="character" w:default="1" w:styleId="DefaultParagraphFont">
     <w:name w:val="Default Paragraph Font"/>
     <w:uiPriority w:val="1"/>
     <w:semiHidden/>
     <w:unhideWhenUsed/>
   </w:style>
-  <w:style w:type="table" w:default="1" w:styleId="Tablanormal">
+  <w:style w:type="table" w:default="1" w:styleId="TableNormal">
     <w:name w:val="Normal Table"/>
     <w:uiPriority w:val="99"/>
     <w:semiHidden/>
@@ -12558,7 +12674,7 @@
       </w:tblCellMar>
     </w:tblPr>
   </w:style>
-  <w:style w:type="numbering" w:default="1" w:styleId="Sinlista">
+  <w:style w:type="numbering" w:default="1" w:styleId="NoList">
     <w:name w:val="No List"/>
     <w:uiPriority w:val="99"/>
     <w:semiHidden/>
@@ -12906,57 +13022,6 @@
 </file>
 
 <file path=customXml/item1.xml><?xml version="1.0" encoding="utf-8"?>
-<b:Sources xmlns:b="http://schemas.openxmlformats.org/officeDocument/2006/bibliography" xmlns="http://schemas.openxmlformats.org/officeDocument/2006/bibliography" SelectedStyle="/APA.XSL" StyleName="APA">
-  <b:Source>
-    <b:Tag>Ley12</b:Tag>
-    <b:SourceType>Book</b:SourceType>
-    <b:Guid>{30580B85-F894-4BAC-A414-B8BEB7118AB8}</b:Guid>
-    <b:Author>
-      <b:Author>
-        <b:Corporate>Ley N° 1581</b:Corporate>
-      </b:Author>
-    </b:Author>
-    <b:Title>Por el cual se dictan disposiciones generales para la protección de datos personales</b:Title>
-    <b:Year>2012</b:Year>
-    <b:RefOrder>9</b:RefOrder>
-  </b:Source>
-  <b:Source>
-    <b:Tag>Ley08</b:Tag>
-    <b:SourceType>Book</b:SourceType>
-    <b:Guid>{6E11106B-91C6-4687-8CDD-FA2CF4228DEF}</b:Guid>
-    <b:Author>
-      <b:Author>
-        <b:Corporate>Ley N° 1266</b:Corporate>
-      </b:Author>
-    </b:Author>
-    <b:Title>Ley de Habeas data</b:Title>
-    <b:Year>2008</b:Year>
-    <b:RefOrder>10</b:RefOrder>
-  </b:Source>
-</b:Sources>
-</file>
-
-<file path=customXml/item2.xml><?xml version="1.0" encoding="utf-8"?>
-<?mso-contentType ?>
-<FormTemplates xmlns="http://schemas.microsoft.com/sharepoint/v3/contenttype/forms">
-  <Display>DocumentLibraryForm</Display>
-  <Edit>DocumentLibraryForm</Edit>
-  <New>DocumentLibraryForm</New>
-</FormTemplates>
-</file>
-
-<file path=customXml/item3.xml><?xml version="1.0" encoding="utf-8"?>
-<p:properties xmlns:p="http://schemas.microsoft.com/office/2006/metadata/properties" xmlns:xsi="http://www.w3.org/2001/XMLSchema-instance" xmlns:pc="http://schemas.microsoft.com/office/infopath/2007/PartnerControls">
-  <documentManagement>
-    <TaxCatchAll xmlns="f35a2fd5-08e7-478b-bda7-bcfb4b219e24" xsi:nil="true"/>
-    <lcf76f155ced4ddcb4097134ff3c332f xmlns="d8632228-6924-4f3a-a352-96f5f6baebad">
-      <Terms xmlns="http://schemas.microsoft.com/office/infopath/2007/PartnerControls"/>
-    </lcf76f155ced4ddcb4097134ff3c332f>
-  </documentManagement>
-</p:properties>
-</file>
-
-<file path=customXml/item4.xml><?xml version="1.0" encoding="utf-8"?>
 <ct:contentTypeSchema xmlns:ct="http://schemas.microsoft.com/office/2006/metadata/contentType" xmlns:ma="http://schemas.microsoft.com/office/2006/metadata/properties/metaAttributes" ct:_="" ma:_="" ma:contentTypeName="Document" ma:contentTypeID="0x0101004F4C335FE0958546A1ABCDC6B1F9252A" ma:contentTypeVersion="13" ma:contentTypeDescription="Create a new document." ma:contentTypeScope="" ma:versionID="eb2ef51c824ae2acd5dd3d126095529b">
   <xsd:schema xmlns:xsd="http://www.w3.org/2001/XMLSchema" xmlns:xs="http://www.w3.org/2001/XMLSchema" xmlns:p="http://schemas.microsoft.com/office/2006/metadata/properties" xmlns:ns2="d8632228-6924-4f3a-a352-96f5f6baebad" xmlns:ns3="f35a2fd5-08e7-478b-bda7-bcfb4b219e24" targetNamespace="http://schemas.microsoft.com/office/2006/metadata/properties" ma:root="true" ma:fieldsID="530ea87b23f1a71d15edd76196b22cd9" ns2:_="" ns3:_="">
     <xsd:import namespace="d8632228-6924-4f3a-a352-96f5f6baebad"/>
@@ -13163,34 +13228,58 @@
 </ct:contentTypeSchema>
 </file>
 
-<file path=customXml/itemProps1.xml><?xml version="1.0" encoding="utf-8"?>
-<ds:datastoreItem xmlns:ds="http://schemas.openxmlformats.org/officeDocument/2006/customXml" ds:itemID="{19589A98-0112-4A65-8CC6-6638EDA22FAC}">
-  <ds:schemaRefs>
-    <ds:schemaRef ds:uri="http://schemas.openxmlformats.org/officeDocument/2006/bibliography"/>
-  </ds:schemaRefs>
-</ds:datastoreItem>
+<file path=customXml/item2.xml><?xml version="1.0" encoding="utf-8"?>
+<p:properties xmlns:p="http://schemas.microsoft.com/office/2006/metadata/properties" xmlns:xsi="http://www.w3.org/2001/XMLSchema-instance" xmlns:pc="http://schemas.microsoft.com/office/infopath/2007/PartnerControls">
+  <documentManagement>
+    <TaxCatchAll xmlns="f35a2fd5-08e7-478b-bda7-bcfb4b219e24" xsi:nil="true"/>
+    <lcf76f155ced4ddcb4097134ff3c332f xmlns="d8632228-6924-4f3a-a352-96f5f6baebad">
+      <Terms xmlns="http://schemas.microsoft.com/office/infopath/2007/PartnerControls"/>
+    </lcf76f155ced4ddcb4097134ff3c332f>
+  </documentManagement>
+</p:properties>
 </file>
 
-<file path=customXml/itemProps2.xml><?xml version="1.0" encoding="utf-8"?>
-<ds:datastoreItem xmlns:ds="http://schemas.openxmlformats.org/officeDocument/2006/customXml" ds:itemID="{8E0E551E-4B5D-4A35-8D27-CFB7B889DCE1}">
-  <ds:schemaRefs>
-    <ds:schemaRef ds:uri="http://schemas.microsoft.com/sharepoint/v3/contenttype/forms"/>
-  </ds:schemaRefs>
-</ds:datastoreItem>
+<file path=customXml/item3.xml><?xml version="1.0" encoding="utf-8"?>
+<?mso-contentType ?>
+<FormTemplates xmlns="http://schemas.microsoft.com/sharepoint/v3/contenttype/forms">
+  <Display>DocumentLibraryForm</Display>
+  <Edit>DocumentLibraryForm</Edit>
+  <New>DocumentLibraryForm</New>
+</FormTemplates>
 </file>
 
-<file path=customXml/itemProps3.xml><?xml version="1.0" encoding="utf-8"?>
-<ds:datastoreItem xmlns:ds="http://schemas.openxmlformats.org/officeDocument/2006/customXml" ds:itemID="{B69FD664-D1DD-45DD-935C-35CA3896B7AB}">
-  <ds:schemaRefs>
-    <ds:schemaRef ds:uri="http://schemas.microsoft.com/office/2006/metadata/properties"/>
-    <ds:schemaRef ds:uri="http://schemas.microsoft.com/office/infopath/2007/PartnerControls"/>
-    <ds:schemaRef ds:uri="f35a2fd5-08e7-478b-bda7-bcfb4b219e24"/>
-    <ds:schemaRef ds:uri="d8632228-6924-4f3a-a352-96f5f6baebad"/>
-  </ds:schemaRefs>
-</ds:datastoreItem>
+<file path=customXml/item4.xml><?xml version="1.0" encoding="utf-8"?>
+<b:Sources xmlns:b="http://schemas.openxmlformats.org/officeDocument/2006/bibliography" xmlns="http://schemas.openxmlformats.org/officeDocument/2006/bibliography" SelectedStyle="/APA.XSL" StyleName="APA">
+  <b:Source>
+    <b:Tag>Ley12</b:Tag>
+    <b:SourceType>Book</b:SourceType>
+    <b:Guid>{30580B85-F894-4BAC-A414-B8BEB7118AB8}</b:Guid>
+    <b:Author>
+      <b:Author>
+        <b:Corporate>Ley N° 1581</b:Corporate>
+      </b:Author>
+    </b:Author>
+    <b:Title>Por el cual se dictan disposiciones generales para la protección de datos personales</b:Title>
+    <b:Year>2012</b:Year>
+    <b:RefOrder>9</b:RefOrder>
+  </b:Source>
+  <b:Source>
+    <b:Tag>Ley08</b:Tag>
+    <b:SourceType>Book</b:SourceType>
+    <b:Guid>{6E11106B-91C6-4687-8CDD-FA2CF4228DEF}</b:Guid>
+    <b:Author>
+      <b:Author>
+        <b:Corporate>Ley N° 1266</b:Corporate>
+      </b:Author>
+    </b:Author>
+    <b:Title>Ley de Habeas data</b:Title>
+    <b:Year>2008</b:Year>
+    <b:RefOrder>10</b:RefOrder>
+  </b:Source>
+</b:Sources>
 </file>
 
-<file path=customXml/itemProps4.xml><?xml version="1.0" encoding="utf-8"?>
+<file path=customXml/itemProps1.xml><?xml version="1.0" encoding="utf-8"?>
 <ds:datastoreItem xmlns:ds="http://schemas.openxmlformats.org/officeDocument/2006/customXml" ds:itemID="{963BE3AE-1E21-4BB3-8471-239664D25BB8}">
   <ds:schemaRefs>
     <ds:schemaRef ds:uri="http://schemas.microsoft.com/office/2006/metadata/contentType"/>
@@ -13207,4 +13296,31 @@
     <ds:schemaRef ds:uri="http://schemas.microsoft.com/internal/obd"/>
   </ds:schemaRefs>
 </ds:datastoreItem>
+</file>
+
+<file path=customXml/itemProps2.xml><?xml version="1.0" encoding="utf-8"?>
+<ds:datastoreItem xmlns:ds="http://schemas.openxmlformats.org/officeDocument/2006/customXml" ds:itemID="{B69FD664-D1DD-45DD-935C-35CA3896B7AB}">
+  <ds:schemaRefs>
+    <ds:schemaRef ds:uri="http://schemas.microsoft.com/office/2006/metadata/properties"/>
+    <ds:schemaRef ds:uri="http://schemas.microsoft.com/office/infopath/2007/PartnerControls"/>
+    <ds:schemaRef ds:uri="f35a2fd5-08e7-478b-bda7-bcfb4b219e24"/>
+    <ds:schemaRef ds:uri="d8632228-6924-4f3a-a352-96f5f6baebad"/>
+  </ds:schemaRefs>
+</ds:datastoreItem>
+</file>
+
+<file path=customXml/itemProps3.xml><?xml version="1.0" encoding="utf-8"?>
+<ds:datastoreItem xmlns:ds="http://schemas.openxmlformats.org/officeDocument/2006/customXml" ds:itemID="{8E0E551E-4B5D-4A35-8D27-CFB7B889DCE1}">
+  <ds:schemaRefs>
+    <ds:schemaRef ds:uri="http://schemas.microsoft.com/sharepoint/v3/contenttype/forms"/>
+  </ds:schemaRefs>
+</ds:datastoreItem>
+</file>
+
+<file path=customXml/itemProps4.xml><?xml version="1.0" encoding="utf-8"?>
+<ds:datastoreItem xmlns:ds="http://schemas.openxmlformats.org/officeDocument/2006/customXml" ds:itemID="{19589A98-0112-4A65-8CC6-6638EDA22FAC}">
+  <ds:schemaRefs>
+    <ds:schemaRef ds:uri="http://schemas.openxmlformats.org/officeDocument/2006/bibliography"/>
+  </ds:schemaRefs>
+</ds:datastoreItem>
 </file>
</xml_diff>